<commit_message>
Roteiro Elvis: revisão da parte 4
Co-Authored-By: Claude Opus 5.5 <noreply@anthropic.com>
Claude-Session: https://claude.ai/code/session_01MJjUEEZrxQDEUifKK2vj9g
</commit_message>
<xml_diff>
--- a/roteiros/elvis/Elvis_Parte4.docx
+++ b/roteiros/elvis/Elvis_Parte4.docx
@@ -255,7 +255,7 @@
         <w:rPr>
           <w:color w:val="000000"/>
         </w:rPr>
-        <w:t>Os amigos de Memphis continuavam em volta dele, dia e noite. Mas eram funcionários, seguranças, gente que dependia do salário que ele pagava. Poucos tinham coragem de contrariar o chefe.</w:t>
+        <w:t>Os amigos de Memphis continuavam em volta dele, dia e noite. Mas eram funcionários e seguranças que dependiam do salário que ele pagava. Poucos tinham coragem de contrariar o chefe.</w:t>
       </w:r>
     </w:p>
     <w:p>
@@ -413,14 +413,6 @@
     <w:p>
       <w:r>
         <w:rPr>
-          <w:color w:val="C00000"/>
-        </w:rPr>
-        <w:t>Agora preste atenção. Porque existem dois documentos nessa história que mostram, em números, o que o Coronel fez com Elvis. Um é de mil novecentos e setenta e três. O outro é de Las Vegas. E quando você colocar os dois lado a lado, vai entender por que tanta gente chama esse homem de ladrão.</w:t>
-      </w:r>
-    </w:p>
-    <w:p>
-      <w:r>
-        <w:rPr>
           <w:color w:val="000000"/>
         </w:rPr>
         <w:t>O terceiro objeto dessa história é uma pilha de papéis assinados em março de mil novecentos e setenta e três.</w:t>
@@ -471,7 +463,7 @@
         <w:rPr>
           <w:color w:val="1F4EB4"/>
         </w:rPr>
-        <w:t>O homem que tinha trocado de nome, que tinha fugido do próprio país, ficou com metade do dinheiro da venda de tudo o que Elvis Presley tinha cantado na vida. E Elvis, que precisava de dinheiro para manter Graceland, os funcionários e o próprio padrão de vida, assinou.</w:t>
+        <w:t>O homem que tinha trocado de nome, que tinha fugido do próprio país, ficou com metade do dinheiro da venda de tudo o que Elvis Presley tinha cantado na vida. E Elvis, que precisava de dinheiro para manter Graceland e pagar o divórcio, assinou.</w:t>
       </w:r>
     </w:p>
     <w:p>
@@ -519,7 +511,7 @@
         <w:rPr>
           <w:color w:val="1F4EB4"/>
         </w:rPr>
-        <w:t>Elvis passou os últimos anos de vida sustentando, show após show, um homem que perdia fortunas na roleta do andar de baixo.</w:t>
+        <w:t>Enquanto o Rei cantava lá em cima, o dinheiro dele descia para a mesa de roleta do andar de baixo.</w:t>
       </w:r>
     </w:p>
     <w:p>

</xml_diff>